<commit_message>
Ajustes reportes y % reaseguro Yeiseth
</commit_message>
<xml_diff>
--- a/Reportes/Contrato de Fianza 313 (Básica).docx
+++ b/Reportes/Contrato de Fianza 313 (Básica).docx
@@ -284,31 +284,7 @@
                 <w:sz w:val="14"/>
                 <w:szCs w:val="14"/>
               </w:rPr>
-              <w:t>{</w:t>
-            </w:r>
-            <w:proofErr w:type="spellStart"/>
-            <w:proofErr w:type="gramStart"/>
-            <w:r>
-              <w:rPr>
-                <w:rFonts w:ascii="Arial" w:eastAsia="Times New Roman" w:hAnsi="Arial" w:cs="Arial"/>
-                <w:b/>
-                <w:color w:val="000000"/>
-                <w:sz w:val="14"/>
-                <w:szCs w:val="14"/>
-              </w:rPr>
-              <w:t>custom.NumeroFianza</w:t>
-            </w:r>
-            <w:proofErr w:type="spellEnd"/>
-            <w:proofErr w:type="gramEnd"/>
-            <w:r>
-              <w:rPr>
-                <w:rFonts w:ascii="Arial" w:eastAsia="Times New Roman" w:hAnsi="Arial" w:cs="Arial"/>
-                <w:b/>
-                <w:color w:val="000000"/>
-                <w:sz w:val="14"/>
-                <w:szCs w:val="14"/>
-              </w:rPr>
-              <w:t>}</w:t>
+              <w:t>{custom.NumeroFianza}</w:t>
             </w:r>
           </w:p>
         </w:tc>
@@ -382,10 +358,8 @@
                 <w:sz w:val="14"/>
                 <w:szCs w:val="14"/>
               </w:rPr>
-              <w:t>{</w:t>
-            </w:r>
-            <w:proofErr w:type="spellStart"/>
-            <w:proofErr w:type="gramStart"/>
+              <w:t>{custom.</w:t>
+            </w:r>
             <w:r>
               <w:rPr>
                 <w:rFonts w:ascii="Arial" w:eastAsia="Times New Roman" w:hAnsi="Arial" w:cs="Arial"/>
@@ -394,20 +368,8 @@
                 <w:sz w:val="14"/>
                 <w:szCs w:val="14"/>
               </w:rPr>
-              <w:t>custom.</w:t>
-            </w:r>
-            <w:r>
-              <w:rPr>
-                <w:rFonts w:ascii="Arial" w:eastAsia="Times New Roman" w:hAnsi="Arial" w:cs="Arial"/>
-                <w:b/>
-                <w:color w:val="000000"/>
-                <w:sz w:val="14"/>
-                <w:szCs w:val="14"/>
-              </w:rPr>
               <w:t>AFavor</w:t>
             </w:r>
-            <w:proofErr w:type="spellEnd"/>
-            <w:proofErr w:type="gramEnd"/>
             <w:r>
               <w:rPr>
                 <w:rFonts w:ascii="Arial" w:eastAsia="Times New Roman" w:hAnsi="Arial" w:cs="Arial"/>
@@ -474,10 +436,8 @@
                 <w:sz w:val="14"/>
                 <w:szCs w:val="14"/>
               </w:rPr>
-              <w:t>{</w:t>
-            </w:r>
-            <w:proofErr w:type="spellStart"/>
-            <w:proofErr w:type="gramStart"/>
+              <w:t>{custom.</w:t>
+            </w:r>
             <w:r>
               <w:rPr>
                 <w:rFonts w:ascii="Arial" w:eastAsia="Times New Roman" w:hAnsi="Arial" w:cs="Arial"/>
@@ -486,20 +446,8 @@
                 <w:sz w:val="14"/>
                 <w:szCs w:val="14"/>
               </w:rPr>
-              <w:t>custom.</w:t>
-            </w:r>
-            <w:r>
-              <w:rPr>
-                <w:rFonts w:ascii="Arial" w:eastAsia="Times New Roman" w:hAnsi="Arial" w:cs="Arial"/>
-                <w:b/>
-                <w:color w:val="000000"/>
-                <w:sz w:val="14"/>
-                <w:szCs w:val="14"/>
-              </w:rPr>
               <w:t>Secuestrante</w:t>
             </w:r>
-            <w:proofErr w:type="spellEnd"/>
-            <w:proofErr w:type="gramEnd"/>
             <w:r>
               <w:rPr>
                 <w:rFonts w:ascii="Arial" w:eastAsia="Times New Roman" w:hAnsi="Arial" w:cs="Arial"/>
@@ -579,10 +527,8 @@
                 <w:sz w:val="14"/>
                 <w:szCs w:val="14"/>
               </w:rPr>
-              <w:t>{</w:t>
-            </w:r>
-            <w:proofErr w:type="spellStart"/>
-            <w:proofErr w:type="gramStart"/>
+              <w:t>{custom.</w:t>
+            </w:r>
             <w:r>
               <w:rPr>
                 <w:rFonts w:ascii="Arial" w:eastAsia="Times New Roman" w:hAnsi="Arial" w:cs="Arial"/>
@@ -591,7 +537,7 @@
                 <w:sz w:val="14"/>
                 <w:szCs w:val="14"/>
               </w:rPr>
-              <w:t>custom.</w:t>
+              <w:t>SumaLetras</w:t>
             </w:r>
             <w:r>
               <w:rPr>
@@ -601,10 +547,8 @@
                 <w:sz w:val="14"/>
                 <w:szCs w:val="14"/>
               </w:rPr>
-              <w:t>SumaTextoTotal</w:t>
-            </w:r>
-            <w:proofErr w:type="spellEnd"/>
-            <w:proofErr w:type="gramEnd"/>
+              <w:t>}</w:t>
+            </w:r>
             <w:r>
               <w:rPr>
                 <w:rFonts w:ascii="Arial" w:eastAsia="Times New Roman" w:hAnsi="Arial" w:cs="Arial"/>
@@ -613,7 +557,7 @@
                 <w:sz w:val="14"/>
                 <w:szCs w:val="14"/>
               </w:rPr>
-              <w:t>}</w:t>
+              <w:t xml:space="preserve"> ({custom.MonedaMonto})</w:t>
             </w:r>
           </w:p>
         </w:tc>
@@ -675,31 +619,7 @@
                 <w:sz w:val="14"/>
                 <w:szCs w:val="14"/>
               </w:rPr>
-              <w:t>{</w:t>
-            </w:r>
-            <w:proofErr w:type="spellStart"/>
-            <w:proofErr w:type="gramStart"/>
-            <w:r>
-              <w:rPr>
-                <w:rFonts w:ascii="Arial" w:eastAsia="Times New Roman" w:hAnsi="Arial" w:cs="Arial"/>
-                <w:b/>
-                <w:color w:val="000000"/>
-                <w:sz w:val="14"/>
-                <w:szCs w:val="14"/>
-              </w:rPr>
-              <w:t>custom.NumeroContrato</w:t>
-            </w:r>
-            <w:proofErr w:type="spellEnd"/>
-            <w:proofErr w:type="gramEnd"/>
-            <w:r>
-              <w:rPr>
-                <w:rFonts w:ascii="Arial" w:eastAsia="Times New Roman" w:hAnsi="Arial" w:cs="Arial"/>
-                <w:b/>
-                <w:color w:val="000000"/>
-                <w:sz w:val="14"/>
-                <w:szCs w:val="14"/>
-              </w:rPr>
-              <w:t>}</w:t>
+              <w:t>{custom.NumeroContrato}</w:t>
             </w:r>
           </w:p>
         </w:tc>
@@ -757,31 +677,7 @@
                 <w:sz w:val="14"/>
                 <w:szCs w:val="14"/>
               </w:rPr>
-              <w:t>{</w:t>
-            </w:r>
-            <w:proofErr w:type="spellStart"/>
-            <w:proofErr w:type="gramStart"/>
-            <w:r>
-              <w:rPr>
-                <w:rFonts w:ascii="Arial" w:eastAsia="Times New Roman" w:hAnsi="Arial" w:cs="Arial"/>
-                <w:b/>
-                <w:color w:val="000000"/>
-                <w:sz w:val="14"/>
-                <w:szCs w:val="14"/>
-              </w:rPr>
-              <w:t>custom.Tenedor</w:t>
-            </w:r>
-            <w:proofErr w:type="spellEnd"/>
-            <w:proofErr w:type="gramEnd"/>
-            <w:r>
-              <w:rPr>
-                <w:rFonts w:ascii="Arial" w:eastAsia="Times New Roman" w:hAnsi="Arial" w:cs="Arial"/>
-                <w:b/>
-                <w:color w:val="000000"/>
-                <w:sz w:val="14"/>
-                <w:szCs w:val="14"/>
-              </w:rPr>
-              <w:t>}</w:t>
+              <w:t>{custom.Tenedor}</w:t>
             </w:r>
           </w:p>
         </w:tc>
@@ -937,9 +833,17 @@
           <w:sz w:val="15"/>
           <w:szCs w:val="15"/>
         </w:rPr>
-        <w:t>B/.({</w:t>
-      </w:r>
-      <w:proofErr w:type="spellStart"/>
+        <w:t>B/.({custom.Suma})</w:t>
+      </w:r>
+      <w:r>
+        <w:rPr>
+          <w:rFonts w:ascii="Arial" w:eastAsia="Times New Roman" w:hAnsi="Arial" w:cs="Arial"/>
+          <w:color w:val="000000"/>
+          <w:sz w:val="15"/>
+          <w:szCs w:val="15"/>
+        </w:rPr>
+        <w:t xml:space="preserve"> para garantizar el pago de los posibles daños y perjuicios que pudieran ocasionarse a</w:t>
+      </w:r>
       <w:r>
         <w:rPr>
           <w:rFonts w:ascii="Arial" w:eastAsia="Times New Roman" w:hAnsi="Arial" w:cs="Arial"/>
@@ -948,9 +852,17 @@
           <w:sz w:val="15"/>
           <w:szCs w:val="15"/>
         </w:rPr>
-        <w:t>custom.Suma</w:t>
-      </w:r>
-      <w:proofErr w:type="spellEnd"/>
+        <w:t xml:space="preserve"> {custom.AFavor},</w:t>
+      </w:r>
+      <w:r>
+        <w:rPr>
+          <w:rFonts w:ascii="Arial" w:eastAsia="Times New Roman" w:hAnsi="Arial" w:cs="Arial"/>
+          <w:color w:val="000000"/>
+          <w:sz w:val="15"/>
+          <w:szCs w:val="15"/>
+        </w:rPr>
+        <w:t xml:space="preserve"> en adelante </w:t>
+      </w:r>
       <w:r>
         <w:rPr>
           <w:rFonts w:ascii="Arial" w:eastAsia="Times New Roman" w:hAnsi="Arial" w:cs="Arial"/>
@@ -959,16 +871,16 @@
           <w:sz w:val="15"/>
           <w:szCs w:val="15"/>
         </w:rPr>
-        <w:t>})</w:t>
-      </w:r>
-      <w:r>
-        <w:rPr>
-          <w:rFonts w:ascii="Arial" w:eastAsia="Times New Roman" w:hAnsi="Arial" w:cs="Arial"/>
-          <w:color w:val="000000"/>
-          <w:sz w:val="15"/>
-          <w:szCs w:val="15"/>
-        </w:rPr>
-        <w:t xml:space="preserve"> para garantizar el pago de los posibles daños y perjuicios que pudieran ocasionarse a</w:t>
+        <w:t>EL SECUESTRADO</w:t>
+      </w:r>
+      <w:r>
+        <w:rPr>
+          <w:rFonts w:ascii="Arial" w:eastAsia="Times New Roman" w:hAnsi="Arial" w:cs="Arial"/>
+          <w:color w:val="000000"/>
+          <w:sz w:val="15"/>
+          <w:szCs w:val="15"/>
+        </w:rPr>
+        <w:t>, como consecuencia del secuestro que se practique en su contra en virtud de petición de secuestro que ha hecho</w:t>
       </w:r>
       <w:r>
         <w:rPr>
@@ -978,89 +890,7 @@
           <w:sz w:val="15"/>
           <w:szCs w:val="15"/>
         </w:rPr>
-        <w:t xml:space="preserve"> {</w:t>
-      </w:r>
-      <w:proofErr w:type="spellStart"/>
-      <w:r>
-        <w:rPr>
-          <w:rFonts w:ascii="Arial" w:eastAsia="Times New Roman" w:hAnsi="Arial" w:cs="Arial"/>
-          <w:b/>
-          <w:color w:val="000000"/>
-          <w:sz w:val="15"/>
-          <w:szCs w:val="15"/>
-        </w:rPr>
-        <w:t>custom.AFavor</w:t>
-      </w:r>
-      <w:proofErr w:type="spellEnd"/>
-      <w:r>
-        <w:rPr>
-          <w:rFonts w:ascii="Arial" w:eastAsia="Times New Roman" w:hAnsi="Arial" w:cs="Arial"/>
-          <w:b/>
-          <w:color w:val="000000"/>
-          <w:sz w:val="15"/>
-          <w:szCs w:val="15"/>
-        </w:rPr>
-        <w:t>},</w:t>
-      </w:r>
-      <w:r>
-        <w:rPr>
-          <w:rFonts w:ascii="Arial" w:eastAsia="Times New Roman" w:hAnsi="Arial" w:cs="Arial"/>
-          <w:color w:val="000000"/>
-          <w:sz w:val="15"/>
-          <w:szCs w:val="15"/>
-        </w:rPr>
-        <w:t xml:space="preserve"> en adelante </w:t>
-      </w:r>
-      <w:r>
-        <w:rPr>
-          <w:rFonts w:ascii="Arial" w:eastAsia="Times New Roman" w:hAnsi="Arial" w:cs="Arial"/>
-          <w:b/>
-          <w:color w:val="000000"/>
-          <w:sz w:val="15"/>
-          <w:szCs w:val="15"/>
-        </w:rPr>
-        <w:t>EL SECUESTRADO</w:t>
-      </w:r>
-      <w:r>
-        <w:rPr>
-          <w:rFonts w:ascii="Arial" w:eastAsia="Times New Roman" w:hAnsi="Arial" w:cs="Arial"/>
-          <w:color w:val="000000"/>
-          <w:sz w:val="15"/>
-          <w:szCs w:val="15"/>
-        </w:rPr>
-        <w:t>, como consecuencia del secuestro que se practique en su contra en virtud de petición de secuestro que ha hecho</w:t>
-      </w:r>
-      <w:r>
-        <w:rPr>
-          <w:rFonts w:ascii="Arial" w:eastAsia="Times New Roman" w:hAnsi="Arial" w:cs="Arial"/>
-          <w:b/>
-          <w:color w:val="000000"/>
-          <w:sz w:val="15"/>
-          <w:szCs w:val="15"/>
-        </w:rPr>
-        <w:t xml:space="preserve"> {</w:t>
-      </w:r>
-      <w:proofErr w:type="spellStart"/>
-      <w:r>
-        <w:rPr>
-          <w:rFonts w:ascii="Arial" w:eastAsia="Times New Roman" w:hAnsi="Arial" w:cs="Arial"/>
-          <w:b/>
-          <w:color w:val="000000"/>
-          <w:sz w:val="15"/>
-          <w:szCs w:val="15"/>
-        </w:rPr>
-        <w:t>custom.Secuestrante</w:t>
-      </w:r>
-      <w:proofErr w:type="spellEnd"/>
-      <w:r>
-        <w:rPr>
-          <w:rFonts w:ascii="Arial" w:eastAsia="Times New Roman" w:hAnsi="Arial" w:cs="Arial"/>
-          <w:b/>
-          <w:color w:val="000000"/>
-          <w:sz w:val="15"/>
-          <w:szCs w:val="15"/>
-        </w:rPr>
-        <w:t xml:space="preserve">} </w:t>
+        <w:t xml:space="preserve"> {custom.Secuestrante} </w:t>
       </w:r>
       <w:r>
         <w:rPr>
@@ -1222,10 +1052,17 @@
           <w:sz w:val="15"/>
           <w:szCs w:val="15"/>
         </w:rPr>
-        <w:t xml:space="preserve"> {</w:t>
-      </w:r>
-      <w:proofErr w:type="spellStart"/>
-      <w:proofErr w:type="gramStart"/>
+        <w:t xml:space="preserve"> {custom.Tenedor}</w:t>
+      </w:r>
+      <w:r>
+        <w:rPr>
+          <w:rFonts w:ascii="Arial" w:eastAsia="Times New Roman" w:hAnsi="Arial" w:cs="Arial"/>
+          <w:color w:val="000000"/>
+          <w:sz w:val="15"/>
+          <w:szCs w:val="15"/>
+        </w:rPr>
+        <w:t xml:space="preserve">. por la suma de </w:t>
+      </w:r>
       <w:r>
         <w:rPr>
           <w:rFonts w:ascii="Arial" w:eastAsia="Times New Roman" w:hAnsi="Arial" w:cs="Arial"/>
@@ -1234,84 +1071,7 @@
           <w:sz w:val="15"/>
           <w:szCs w:val="15"/>
         </w:rPr>
-        <w:t>custom.Tenedor</w:t>
-      </w:r>
-      <w:proofErr w:type="spellEnd"/>
-      <w:proofErr w:type="gramEnd"/>
-      <w:r>
-        <w:rPr>
-          <w:rFonts w:ascii="Arial" w:eastAsia="Times New Roman" w:hAnsi="Arial" w:cs="Arial"/>
-          <w:b/>
-          <w:color w:val="000000"/>
-          <w:sz w:val="15"/>
-          <w:szCs w:val="15"/>
-        </w:rPr>
-        <w:t>}</w:t>
-      </w:r>
-      <w:r>
-        <w:rPr>
-          <w:rFonts w:ascii="Arial" w:eastAsia="Times New Roman" w:hAnsi="Arial" w:cs="Arial"/>
-          <w:color w:val="000000"/>
-          <w:sz w:val="15"/>
-          <w:szCs w:val="15"/>
-        </w:rPr>
-        <w:t xml:space="preserve">. por la suma de </w:t>
-      </w:r>
-      <w:r>
-        <w:rPr>
-          <w:rFonts w:ascii="Arial" w:eastAsia="Times New Roman" w:hAnsi="Arial" w:cs="Arial"/>
-          <w:b/>
-          <w:color w:val="000000"/>
-          <w:sz w:val="15"/>
-          <w:szCs w:val="15"/>
-        </w:rPr>
-        <w:t>{</w:t>
-      </w:r>
-      <w:proofErr w:type="spellStart"/>
-      <w:proofErr w:type="gramStart"/>
-      <w:r>
-        <w:rPr>
-          <w:rFonts w:ascii="Arial" w:eastAsia="Times New Roman" w:hAnsi="Arial" w:cs="Arial"/>
-          <w:b/>
-          <w:color w:val="000000"/>
-          <w:sz w:val="15"/>
-          <w:szCs w:val="15"/>
-        </w:rPr>
-        <w:t>custom.MonedaMonto</w:t>
-      </w:r>
-      <w:proofErr w:type="spellEnd"/>
-      <w:proofErr w:type="gramEnd"/>
-      <w:r>
-        <w:rPr>
-          <w:rFonts w:ascii="Arial" w:eastAsia="Times New Roman" w:hAnsi="Arial" w:cs="Arial"/>
-          <w:b/>
-          <w:color w:val="000000"/>
-          <w:sz w:val="15"/>
-          <w:szCs w:val="15"/>
-        </w:rPr>
-        <w:t>} ({</w:t>
-      </w:r>
-      <w:proofErr w:type="spellStart"/>
-      <w:r>
-        <w:rPr>
-          <w:rFonts w:ascii="Arial" w:eastAsia="Times New Roman" w:hAnsi="Arial" w:cs="Arial"/>
-          <w:b/>
-          <w:color w:val="000000"/>
-          <w:sz w:val="15"/>
-          <w:szCs w:val="15"/>
-        </w:rPr>
-        <w:t>custom.SumaLetras</w:t>
-      </w:r>
-      <w:proofErr w:type="spellEnd"/>
-      <w:r>
-        <w:rPr>
-          <w:rFonts w:ascii="Arial" w:eastAsia="Times New Roman" w:hAnsi="Arial" w:cs="Arial"/>
-          <w:b/>
-          <w:color w:val="000000"/>
-          <w:sz w:val="15"/>
-          <w:szCs w:val="15"/>
-        </w:rPr>
-        <w:t>})</w:t>
+        <w:t>{custom.MonedaMonto} ({custom.SumaLetras})</w:t>
       </w:r>
       <w:r>
         <w:rPr>
@@ -2149,29 +1909,7 @@
           <w:sz w:val="15"/>
           <w:szCs w:val="15"/>
         </w:rPr>
-        <w:t>EN FE DE LO CUAL, se suscribe este Contrato en la ciudad de Panamá, República de Panamá, {</w:t>
-      </w:r>
-      <w:proofErr w:type="spellStart"/>
-      <w:proofErr w:type="gramStart"/>
-      <w:r>
-        <w:rPr>
-          <w:rFonts w:ascii="Arial" w:eastAsia="Times New Roman" w:hAnsi="Arial" w:cs="Arial"/>
-          <w:color w:val="000000"/>
-          <w:sz w:val="15"/>
-          <w:szCs w:val="15"/>
-        </w:rPr>
-        <w:t>custom.FechaActualTextoMin</w:t>
-      </w:r>
-      <w:proofErr w:type="spellEnd"/>
-      <w:proofErr w:type="gramEnd"/>
-      <w:r>
-        <w:rPr>
-          <w:rFonts w:ascii="Arial" w:eastAsia="Times New Roman" w:hAnsi="Arial" w:cs="Arial"/>
-          <w:color w:val="000000"/>
-          <w:sz w:val="15"/>
-          <w:szCs w:val="15"/>
-        </w:rPr>
-        <w:t>}.</w:t>
+        <w:t>EN FE DE LO CUAL, se suscribe este Contrato en la ciudad de Panamá, República de Panamá, {custom.FechaActualTextoMin}.</w:t>
       </w:r>
     </w:p>
     <w:p/>
@@ -2295,26 +2033,15 @@
                 <w:b/>
                 <w:bCs/>
               </w:rPr>
-              <w:t>{</w:t>
-            </w:r>
-            <w:proofErr w:type="spellStart"/>
-            <w:proofErr w:type="gramStart"/>
+              <w:t>{custom.</w:t>
+            </w:r>
             <w:r>
               <w:rPr>
                 <w:b/>
                 <w:bCs/>
               </w:rPr>
-              <w:t>custom.</w:t>
-            </w:r>
-            <w:r>
-              <w:rPr>
-                <w:b/>
-                <w:bCs/>
-              </w:rPr>
               <w:t>Secuestrante</w:t>
             </w:r>
-            <w:proofErr w:type="spellEnd"/>
-            <w:proofErr w:type="gramEnd"/>
             <w:r>
               <w:rPr>
                 <w:b/>

</xml_diff>